<commit_message>
report: separate personal problem-solving sections
</commit_message>
<xml_diff>
--- a/report/experiment3_personal_report_yangmuqing.docx
+++ b/report/experiment3_personal_report_yangmuqing.docx
@@ -1608,12 +1608,57 @@
     <w:p>
       <w:r>
         <w:rPr>
-          <w:rFonts w:ascii="Microsoft YaHei" w:hAnsi="Microsoft YaHei" w:eastAsia="Microsoft YaHei"/>
+          <w:b/>
+        </w:rPr>
+        <w:t>现象：</w:t>
+      </w:r>
+      <w:r>
+        <w:rPr>
           <w:b w:val="0"/>
-          <w:color w:val="202124"/>
-          <w:sz w:val="21"/>
         </w:rPr>
-        <w:t>现象：三分类场景沿用默认关节姿态后，夹爪没有落在圆柱中心，下降时会擦到目标边缘。调查：我在 GUI 中暂停于 above 和 pick，比较末端与圆柱中心的相对位置，并逐个检查六个网格的接近方向。处理：以已验证的 A-B 动作为参照，为每个网格重新调节 above 和 pick 航点，先单目标验证，再并入总序列。验证：修正后前几个目标能够按顺序对准并抬升，航点名称和控制台记录保持一致。</w:t>
+        <w:t>三分类场景沿用默认关节姿态后，夹爪没有落在圆柱中心，下降时会擦到目标边缘。</w:t>
+      </w:r>
+    </w:p>
+    <w:p>
+      <w:r>
+        <w:rPr>
+          <w:b/>
+        </w:rPr>
+        <w:t>原因分析：</w:t>
+      </w:r>
+      <w:r>
+        <w:rPr>
+          <w:b w:val="0"/>
+        </w:rPr>
+        <w:t>我在 GUI 中暂停于 above 和 pick，比较末端与圆柱中心的相对位置，并逐个检查六个网格的接近方向。</w:t>
+      </w:r>
+    </w:p>
+    <w:p>
+      <w:r>
+        <w:rPr>
+          <w:b/>
+        </w:rPr>
+        <w:t>处理方法：</w:t>
+      </w:r>
+      <w:r>
+        <w:rPr>
+          <w:b w:val="0"/>
+        </w:rPr>
+        <w:t>以已验证的 A-B 动作为参照，为每个网格重新调节 above 和 pick 航点，先单目标验证，再并入总序列。</w:t>
+      </w:r>
+    </w:p>
+    <w:p>
+      <w:r>
+        <w:rPr>
+          <w:b/>
+        </w:rPr>
+        <w:t>验证结果：</w:t>
+      </w:r>
+      <w:r>
+        <w:rPr>
+          <w:b w:val="0"/>
+        </w:rPr>
+        <w:t>修正后前几个目标能够按顺序对准并抬升，航点名称和控制台记录保持一致。</w:t>
       </w:r>
     </w:p>
     <w:p>
@@ -1627,12 +1672,57 @@
     <w:p>
       <w:r>
         <w:rPr>
-          <w:rFonts w:ascii="Microsoft YaHei" w:hAnsi="Microsoft YaHei" w:eastAsia="Microsoft YaHei"/>
+          <w:b/>
+        </w:rPr>
+        <w:t>现象：</w:t>
+      </w:r>
+      <w:r>
+        <w:rPr>
           <w:b w:val="0"/>
-          <w:color w:val="202124"/>
-          <w:sz w:val="21"/>
         </w:rPr>
-        <w:t>现象：日志显示 pick 已触发，但圆柱仍停在桌面，夹爪抬升后目标没有跟随。调查：我将动作拆成闭合、距离检查和抬升三段，发现播放器只发送夹爪命令，没有保存目标与末端的相对位姿。处理：增加目标选择和附着跟随逻辑，在搬运中持续更新相对偏移，并把目标高度超过 0.075 m 作为画面取证条件。验证：夹爪闭合后目标位于两指之间并离开桌面，同时出现 attached 事件。</w:t>
+        <w:t>日志显示 pick 已触发，但圆柱仍停在桌面，夹爪抬升后目标没有跟随。</w:t>
+      </w:r>
+    </w:p>
+    <w:p>
+      <w:r>
+        <w:rPr>
+          <w:b/>
+        </w:rPr>
+        <w:t>原因分析：</w:t>
+      </w:r>
+      <w:r>
+        <w:rPr>
+          <w:b w:val="0"/>
+        </w:rPr>
+        <w:t>我将动作拆成闭合、距离检查和抬升三段，发现播放器只发送夹爪命令，没有保存目标与末端的相对位姿。</w:t>
+      </w:r>
+    </w:p>
+    <w:p>
+      <w:r>
+        <w:rPr>
+          <w:b/>
+        </w:rPr>
+        <w:t>处理方法：</w:t>
+      </w:r>
+      <w:r>
+        <w:rPr>
+          <w:b w:val="0"/>
+        </w:rPr>
+        <w:t>增加目标选择和附着跟随逻辑，在搬运中持续更新相对偏移，并把目标高度超过 0.075 m 作为画面取证条件。</w:t>
+      </w:r>
+    </w:p>
+    <w:p>
+      <w:r>
+        <w:rPr>
+          <w:b/>
+        </w:rPr>
+        <w:t>验证结果：</w:t>
+      </w:r>
+      <w:r>
+        <w:rPr>
+          <w:b w:val="0"/>
+        </w:rPr>
+        <w:t>夹爪闭合后目标位于两指之间并离开桌面，同时出现 attached 事件。</w:t>
       </w:r>
     </w:p>
     <w:p>
@@ -1694,12 +1784,57 @@
     <w:p>
       <w:r>
         <w:rPr>
-          <w:rFonts w:ascii="Microsoft YaHei" w:hAnsi="Microsoft YaHei" w:eastAsia="Microsoft YaHei"/>
+          <w:b/>
+        </w:rPr>
+        <w:t>现象：</w:t>
+      </w:r>
+      <w:r>
+        <w:rPr>
           <w:b w:val="0"/>
-          <w:color w:val="202124"/>
-          <w:sz w:val="21"/>
         </w:rPr>
-        <w:t>现象：目标直接写到分类垫中心时，画面缺少真实释放过程；同色目标会落在完全相同的位置。调查：我分别观察释放前后的末端坐标、目标高度和横向位移，确认横向跳变会让落点受瞬时速度影响。处理：从当前末端位置开始，保持 X/Y 不变，解除附着后只沿 Z 方向下落，并给同色目标分配不同落点。验证：画面连续呈现对准、解除附着、下落和稳定四个阶段，最终落点形成清晰间隔。</w:t>
+        <w:t>目标直接写到分类垫中心时，画面缺少真实释放过程；同色目标会落在完全相同的位置。</w:t>
+      </w:r>
+    </w:p>
+    <w:p>
+      <w:r>
+        <w:rPr>
+          <w:b/>
+        </w:rPr>
+        <w:t>原因分析：</w:t>
+      </w:r>
+      <w:r>
+        <w:rPr>
+          <w:b w:val="0"/>
+        </w:rPr>
+        <w:t>我分别观察释放前后的末端坐标、目标高度和横向位移，确认横向跳变会让落点受瞬时速度影响。</w:t>
+      </w:r>
+    </w:p>
+    <w:p>
+      <w:r>
+        <w:rPr>
+          <w:b/>
+        </w:rPr>
+        <w:t>处理方法：</w:t>
+      </w:r>
+      <w:r>
+        <w:rPr>
+          <w:b w:val="0"/>
+        </w:rPr>
+        <w:t>从当前末端位置开始，保持 X/Y 不变，解除附着后只沿 Z 方向下落，并给同色目标分配不同落点。</w:t>
+      </w:r>
+    </w:p>
+    <w:p>
+      <w:r>
+        <w:rPr>
+          <w:b/>
+        </w:rPr>
+        <w:t>验证结果：</w:t>
+      </w:r>
+      <w:r>
+        <w:rPr>
+          <w:b w:val="0"/>
+        </w:rPr>
+        <w:t>画面连续呈现对准、解除附着、下落和稳定四个阶段，最终落点形成清晰间隔。</w:t>
       </w:r>
     </w:p>
     <w:p>
@@ -1713,12 +1848,57 @@
     <w:p>
       <w:r>
         <w:rPr>
-          <w:rFonts w:ascii="Microsoft YaHei" w:hAnsi="Microsoft YaHei" w:eastAsia="Microsoft YaHei"/>
+          <w:b/>
+        </w:rPr>
+        <w:t>现象：</w:t>
+      </w:r>
+      <w:r>
+        <w:rPr>
           <w:b w:val="0"/>
-          <w:color w:val="202124"/>
-          <w:sz w:val="21"/>
         </w:rPr>
-        <w:t>现象：调整场景坐标后，任务节点只识别到少数目标，完整计划中出现空缺。调查：我对比世界中三行目标的位置和监视节点使用的像素行坐标，发现场景已经变化而旧网格参数仍被加载。处理：根据投影关系重新计算三行像素坐标 186、240、294，并清理旧实例后重新启动。验证：六个目标都得到唯一 grid_id，任务队列的对象顺序与俯视图一致。</w:t>
+        <w:t>调整场景坐标后，任务节点只识别到少数目标，完整计划中出现空缺。</w:t>
+      </w:r>
+    </w:p>
+    <w:p>
+      <w:r>
+        <w:rPr>
+          <w:b/>
+        </w:rPr>
+        <w:t>原因分析：</w:t>
+      </w:r>
+      <w:r>
+        <w:rPr>
+          <w:b w:val="0"/>
+        </w:rPr>
+        <w:t>我对比世界中三行目标的位置和监视节点使用的像素行坐标，发现场景已经变化而旧网格参数仍被加载。</w:t>
+      </w:r>
+    </w:p>
+    <w:p>
+      <w:r>
+        <w:rPr>
+          <w:b/>
+        </w:rPr>
+        <w:t>处理方法：</w:t>
+      </w:r>
+      <w:r>
+        <w:rPr>
+          <w:b w:val="0"/>
+        </w:rPr>
+        <w:t>根据投影关系重新计算三行像素坐标 186、240、294，并清理旧实例后重新启动。</w:t>
+      </w:r>
+    </w:p>
+    <w:p>
+      <w:r>
+        <w:rPr>
+          <w:b/>
+        </w:rPr>
+        <w:t>验证结果：</w:t>
+      </w:r>
+      <w:r>
+        <w:rPr>
+          <w:b w:val="0"/>
+        </w:rPr>
+        <w:t>六个目标都得到唯一 grid_id，任务队列的对象顺序与俯视图一致。</w:t>
       </w:r>
     </w:p>
     <w:p>
@@ -1732,12 +1912,57 @@
     <w:p>
       <w:r>
         <w:rPr>
-          <w:rFonts w:ascii="Microsoft YaHei" w:hAnsi="Microsoft YaHei" w:eastAsia="Microsoft YaHei"/>
+          <w:b/>
+        </w:rPr>
+        <w:t>现象：</w:t>
+      </w:r>
+      <w:r>
+        <w:rPr>
           <w:b w:val="0"/>
-          <w:color w:val="202124"/>
-          <w:sz w:val="21"/>
         </w:rPr>
-        <w:t>现象：界面看起来正常，但播放器发送动作后机械臂没有响应，或者同一动作被重复触发。调查：我检查 world、controller 和播放器进程，发现旧 Gazebo master 与新实例同时存在。处理：结束旧进程，只保留一个世界；手动 GUI 已打开时直接连接播放器。验证：控制器只收到一套命令，单目标测试和整序列播放都按预期推进。</w:t>
+        <w:t>界面看起来正常，但播放器发送动作后机械臂没有响应，或者同一动作被重复触发。</w:t>
+      </w:r>
+    </w:p>
+    <w:p>
+      <w:r>
+        <w:rPr>
+          <w:b/>
+        </w:rPr>
+        <w:t>原因分析：</w:t>
+      </w:r>
+      <w:r>
+        <w:rPr>
+          <w:b w:val="0"/>
+        </w:rPr>
+        <w:t>我检查 world、controller 和播放器进程，发现旧 Gazebo master 与新实例同时存在。</w:t>
+      </w:r>
+    </w:p>
+    <w:p>
+      <w:r>
+        <w:rPr>
+          <w:b/>
+        </w:rPr>
+        <w:t>处理方法：</w:t>
+      </w:r>
+      <w:r>
+        <w:rPr>
+          <w:b w:val="0"/>
+        </w:rPr>
+        <w:t>结束旧进程，只保留一个世界；手动 GUI 已打开时直接连接播放器。</w:t>
+      </w:r>
+    </w:p>
+    <w:p>
+      <w:r>
+        <w:rPr>
+          <w:b/>
+        </w:rPr>
+        <w:t>验证结果：</w:t>
+      </w:r>
+      <w:r>
+        <w:rPr>
+          <w:b w:val="0"/>
+        </w:rPr>
+        <w:t>控制器只收到一套命令，单目标测试和整序列播放都按预期推进。</w:t>
       </w:r>
     </w:p>
     <w:p>
@@ -1751,12 +1976,57 @@
     <w:p>
       <w:r>
         <w:rPr>
-          <w:rFonts w:ascii="Microsoft YaHei" w:hAnsi="Microsoft YaHei" w:eastAsia="Microsoft YaHei"/>
+          <w:b/>
+        </w:rPr>
+        <w:t>现象：</w:t>
+      </w:r>
+      <w:r>
+        <w:rPr>
           <w:b w:val="0"/>
-          <w:color w:val="202124"/>
-          <w:sz w:val="21"/>
         </w:rPr>
-        <w:t>现象：任务节点启动后立即退出，终端提示日志调用参数不兼容。调查：我定位到 Humble Python logger 的调用方式与当前代码不一致，错误发生在真正进入任务状态机之前。处理：改用兼容的 f-string 日志写法，重新构建并在干净终端中启动节点。验证：节点保持运行并继续发布状态，抓取问题可以在稳定的启动环境中单独分析。</w:t>
+        <w:t>任务节点启动后立即退出，终端提示日志调用参数不兼容。</w:t>
+      </w:r>
+    </w:p>
+    <w:p>
+      <w:r>
+        <w:rPr>
+          <w:b/>
+        </w:rPr>
+        <w:t>原因分析：</w:t>
+      </w:r>
+      <w:r>
+        <w:rPr>
+          <w:b w:val="0"/>
+        </w:rPr>
+        <w:t>我定位到 Humble Python logger 的调用方式与当前代码不一致，错误发生在真正进入任务状态机之前。</w:t>
+      </w:r>
+    </w:p>
+    <w:p>
+      <w:r>
+        <w:rPr>
+          <w:b/>
+        </w:rPr>
+        <w:t>处理方法：</w:t>
+      </w:r>
+      <w:r>
+        <w:rPr>
+          <w:b w:val="0"/>
+        </w:rPr>
+        <w:t>改用兼容的 f-string 日志写法，重新构建并在干净终端中启动节点。</w:t>
+      </w:r>
+    </w:p>
+    <w:p>
+      <w:r>
+        <w:rPr>
+          <w:b/>
+        </w:rPr>
+        <w:t>验证结果：</w:t>
+      </w:r>
+      <w:r>
+        <w:rPr>
+          <w:b w:val="0"/>
+        </w:rPr>
+        <w:t>节点保持运行并继续发布状态，抓取问题可以在稳定的启动环境中单独分析。</w:t>
       </w:r>
     </w:p>
     <w:tbl>

</xml_diff>

<commit_message>
report: enrich personal problem-solving evidence
</commit_message>
<xml_diff>
--- a/report/experiment3_personal_report_yangmuqing.docx
+++ b/report/experiment3_personal_report_yangmuqing.docx
@@ -1588,13 +1588,7 @@
     </w:p>
     <w:p>
       <w:r>
-        <w:rPr>
-          <w:rFonts w:ascii="Microsoft YaHei" w:hAnsi="Microsoft YaHei" w:eastAsia="Microsoft YaHei"/>
-          <w:b w:val="0"/>
-          <w:color w:val="202124"/>
-          <w:sz w:val="21"/>
-        </w:rPr>
-        <w:t>本节沿用实验二个人报告的写法，将每个问题记录为“现象—调查—处理—验证”，判断依据具体落实到坐标、日志事件和场景状态。</w:t>
+        <w:t>本节把调试过程按问题逐项复盘。每项都记录实际看到的画面或日志、对应的检查位置、具体修改的航点、参数或节点，以及修改后的验证条件。红蓝基线的对象级结论以mecharm_sorting_execution.csv 为准，三分类扩展只写已经有场景和序列证据的内容。</w:t>
       </w:r>
     </w:p>
     <w:p>
@@ -1613,10 +1607,7 @@
         <w:t>现象：</w:t>
       </w:r>
       <w:r>
-        <w:rPr>
-          <w:b w:val="0"/>
-        </w:rPr>
-        <w:t>三分类场景沿用默认关节姿态后，夹爪没有落在圆柱中心，下降时会擦到目标边缘。</w:t>
+        <w:t>三分类场景第一次播放绿色目标时，机械臂从 above_green_1 下到 pick_4 后，夹爪中心没有落在圆柱中心线上，右侧指尖先碰到圆柱边缘；above_green_2/pick_5 也出现相同趋势。画面中夹爪虽然闭合，但圆柱没有被稳定夹在两指之间。</w:t>
       </w:r>
     </w:p>
     <w:p>
@@ -1627,10 +1618,7 @@
         <w:t>原因分析：</w:t>
       </w:r>
       <w:r>
-        <w:rPr>
-          <w:b w:val="0"/>
-        </w:rPr>
-        <w:t>我在 GUI 中暂停于 above 和 pick，比较末端与圆柱中心的相对位置，并逐个检查六个网格的接近方向。</w:t>
+        <w:t>我在 manual_control_panel 中暂停在上述两个航点，逐个拖动关节滑块，对照 sorting_scene.yaml 中六个取物点和俯视图观察末端位置。原来的默认姿态是为固定点 A-B 标定的，直接复用到绿色格点时，末端接近方向与圆柱中心不一致；因此问题不在夹爪开度，而在每个网格对应的 above/pick 姿态没有单独校准。</w:t>
       </w:r>
     </w:p>
     <w:p>
@@ -1641,10 +1629,7 @@
         <w:t>处理方法：</w:t>
       </w:r>
       <w:r>
-        <w:rPr>
-          <w:b w:val="0"/>
-        </w:rPr>
-        <w:t>以已验证的 A-B 动作为参照，为每个网格重新调节 above 和 pick 航点，先单目标验证，再并入总序列。</w:t>
+        <w:t>以红蓝基线已经验证的动作顺序为模板，重新保存 above_green_1→pick_4 和 above_green_2→pick_5 两组航点：above 阶段保持夹爪开度 0.15、接触垫力 -4.0，pick 阶段切换到夹爪 -0.31，并把每个动作时长固定为 2.0 s。每次只修改一组航点，先在 GUI 中单步执行，再写回 manual_animation.json，最后重新组织 34 步总序列。</w:t>
       </w:r>
     </w:p>
     <w:p>
@@ -1655,10 +1640,7 @@
         <w:t>验证结果：</w:t>
       </w:r>
       <w:r>
-        <w:rPr>
-          <w:b w:val="0"/>
-        </w:rPr>
-        <w:t>修正后前几个目标能够按顺序对准并抬升，航点名称和控制台记录保持一致。</w:t>
+        <w:t>单目标测试时，两指从圆柱两侧同时接近，夹爪闭合后没有明显侧滑；随后按 manual_animation.json 的六目标顺序播放，绿色目标的 pick_4/pick_5 不再与边缘碰撞。验证依据是手动控制台截图、六目标序列图和 Gazebo 录屏，不把这部分扩写成三分类对象级成功率。</w:t>
       </w:r>
     </w:p>
     <w:p>
@@ -1677,10 +1659,7 @@
         <w:t>现象：</w:t>
       </w:r>
       <w:r>
-        <w:rPr>
-          <w:b w:val="0"/>
-        </w:rPr>
-        <w:t>日志显示 pick 已触发，但圆柱仍停在桌面，夹爪抬升后目标没有跟随。</w:t>
+        <w:t>一次蓝色圆柱测试中，日志已经出现 pick 和 close_gripper，但圆柱仍停在桌面约 z=0.0275 m，机械臂抬升后夹爪下方为空；仅凭夹爪闭合会把这次动作误判为成功。</w:t>
       </w:r>
     </w:p>
     <w:p>
@@ -1691,10 +1670,7 @@
         <w:t>原因分析：</w:t>
       </w:r>
       <w:r>
-        <w:rPr>
-          <w:b w:val="0"/>
-        </w:rPr>
-        <w:t>我将动作拆成闭合、距离检查和抬升三段，发现播放器只发送夹爪命令，没有保存目标与末端的相对位姿。</w:t>
+        <w:t>我把动作拆成闭合、距离检查和抬升三段，发现原来的播放器只发布夹爪和机械臂的 JointTrajectory，没有保存目标与末端的相对位姿。修复前，sorting_executor.py 没有把 /gazebo/model_states 中的目标位姿和 /gazebo/link_states 中的夹爪位姿绑定起来，所以“命令已经发出”不等于“目标已经附着”。</w:t>
       </w:r>
     </w:p>
     <w:p>
@@ -1705,10 +1681,7 @@
         <w:t>处理方法：</w:t>
       </w:r>
       <w:r>
-        <w:rPr>
-          <w:b w:val="0"/>
-        </w:rPr>
-        <w:t>增加目标选择和附着跟随逻辑，在搬运中持续更新相对偏移，并把目标高度超过 0.075 m 作为画面取证条件。</w:t>
+        <w:t>在 sorting_executor.py 中加入抓取对象选择和距离检查，抓取位置容差设为 0.05 m；确认对象后保存 attach_offset，并通过 /gazebo/set_entity_state 以约 0.06 s 的周期更新被选模型的位置。状态机同时写入 grasp_attached 事件；未找到近邻目标时进入 failed/exception 分支，并把目标高度超过 0.075 m 作为画面取证条件。</w:t>
       </w:r>
     </w:p>
     <w:p>
@@ -1719,10 +1692,7 @@
         <w:t>验证结果：</w:t>
       </w:r>
       <w:r>
-        <w:rPr>
-          <w:b w:val="0"/>
-        </w:rPr>
-        <w:t>夹爪闭合后目标位于两指之间并离开桌面，同时出现 attached 事件。</w:t>
+        <w:t>重新运行单目标测试后，blue_cylinder_grasp_verified.png 中可以看到圆柱位于两指之间并已离开桌面。对应 CSV 依次出现 grasp_attached、lift、release 和 object_complete 事件，状态均为 passed，说明验证的是目标确实随末端抬升，而不是只看夹爪是否闭合。</w:t>
       </w:r>
     </w:p>
     <w:p>
@@ -1789,10 +1759,7 @@
         <w:t>现象：</w:t>
       </w:r>
       <w:r>
-        <w:rPr>
-          <w:b w:val="0"/>
-        </w:rPr>
-        <w:t>目标直接写到分类垫中心时，画面缺少真实释放过程；同色目标会落在完全相同的位置。</w:t>
+        <w:t>第一次释放测试把目标直接写到分类垫中心，画面没有连续的对准、解除附着和下落过程；同一颜色的两个目标还会落在完全相同的位置，后一目标遮住前一目标，无法从最终画面判断是否逐个完成。</w:t>
       </w:r>
     </w:p>
     <w:p>
@@ -1803,10 +1770,7 @@
         <w:t>原因分析：</w:t>
       </w:r>
       <w:r>
-        <w:rPr>
-          <w:b w:val="0"/>
-        </w:rPr>
-        <w:t>我分别观察释放前后的末端坐标、目标高度和横向位移，确认横向跳变会让落点受瞬时速度影响。</w:t>
+        <w:t>检查 release 阶段后，我发现一次 SetEntityState 调用同时改变了目标的 X、Y、Z，目标会在相邻帧之间横向跳变，原来的播放序列也没有为同色目标维护不同的落点索引。因此即使最终坐标看起来正确，释放过程仍不符合验收时对动作连续性和结果可复查性的要求。</w:t>
       </w:r>
     </w:p>
     <w:p>
@@ -1817,10 +1781,7 @@
         <w:t>处理方法：</w:t>
       </w:r>
       <w:r>
-        <w:rPr>
-          <w:b w:val="0"/>
-        </w:rPr>
-        <w:t>从当前末端位置开始，保持 X/Y 不变，解除附着后只沿 Z 方向下落，并给同色目标分配不同落点。</w:t>
+        <w:t>在执行器中为 red、blue、green 分别建立落点列表：红色使用 (0.115,-0.15)、(0.14,-0.12)、(0.165,-0.09)，蓝色使用 (0.235,-0.15)、(0.26,-0.12)、(0.285,-0.09)，绿色使用 (0.34,-0.02)、(0.38,0.02)。释放时保持 X/Y 对齐，解除附着后再沿 Z 方向下落，并在放开夹爪后等待稳定；验证阶段检查 XY 误差不超过 0.07 m，超出则记录 release pose outside destination。</w:t>
       </w:r>
     </w:p>
     <w:p>
@@ -1831,10 +1792,7 @@
         <w:t>验证结果：</w:t>
       </w:r>
       <w:r>
-        <w:rPr>
-          <w:b w:val="0"/>
-        </w:rPr>
-        <w:t>画面连续呈现对准、解除附着、下落和稳定四个阶段，最终落点形成清晰间隔。</w:t>
+        <w:t>release_stages.png 中连续呈现了到达释放位、解除附着、垂直下落和稳定四个阶段，同色圆柱的最终落点也形成间隔。CSV 的 release 记录保存了 destination 坐标，随后写入 object_complete；因此这一修改同时解决了画面跳变和同色目标重叠两个问题。</w:t>
       </w:r>
     </w:p>
     <w:p>
@@ -1853,10 +1811,7 @@
         <w:t>现象：</w:t>
       </w:r>
       <w:r>
-        <w:rPr>
-          <w:b w:val="0"/>
-        </w:rPr>
-        <w:t>调整场景坐标后，任务节点只识别到少数目标，完整计划中出现空缺。</w:t>
+        <w:t>调整场景坐标后，任务节点只识别到少数目标，完整计划中出现空缺；从俯视图看六个圆柱都在桌面上，但任务日志中的目标数量与画面不一致。这个问题导致后续抓取序列缺少对象，并不是机械臂动作本身失败。</w:t>
       </w:r>
     </w:p>
     <w:p>
@@ -1867,10 +1822,7 @@
         <w:t>原因分析：</w:t>
       </w:r>
       <w:r>
-        <w:rPr>
-          <w:b w:val="0"/>
-        </w:rPr>
-        <w:t>我对比世界中三行目标的位置和监视节点使用的像素行坐标，发现场景已经变化而旧网格参数仍被加载。</w:t>
+        <w:t>我对比世界中三行目标的位置、sorting_scene_monitor.py 的投影公式和 sorting_task.py 使用的像素网格，发现场景已经变化而旧网格参数仍被加载。当前投影把 world-y 映射到图像横坐标、world-x 映射到图像纵坐标，若仍使用旧行坐标，检测框中心就会被分到错误网格或判定为网格外。</w:t>
       </w:r>
     </w:p>
     <w:p>
@@ -1881,10 +1833,7 @@
         <w:t>处理方法：</w:t>
       </w:r>
       <w:r>
-        <w:rPr>
-          <w:b w:val="0"/>
-        </w:rPr>
-        <w:t>根据投影关系重新计算三行像素坐标 186、240、294，并清理旧实例后重新启动。</w:t>
+        <w:t>根据新的投影关系重新计算三行像素坐标 186、240、294，并保留列坐标 212、266、320；同时把 grid_tolerance_px 固定为 48，清理旧实例后重新启动 monitor、task 和 executor。为避免目标搬走后再次触发空计划，还保留了检测签名去重和 execute_motion 下的 plan_locked 保护。</w:t>
       </w:r>
     </w:p>
     <w:p>
@@ -1895,10 +1844,7 @@
         <w:t>验证结果：</w:t>
       </w:r>
       <w:r>
-        <w:rPr>
-          <w:b w:val="0"/>
-        </w:rPr>
-        <w:t>六个目标都得到唯一 grid_id，任务队列的对象顺序与俯视图一致。</w:t>
+        <w:t>重新启动后，grid_mapping.png 中的检测框中心与六个网格一一对应，日志中的 grid_id 不再重复或缺失。红蓝基线 CSV 的 task_result 记录 count=6、success_count=6，六个对象分别得到唯一网格，说明坐标修正已经传递到任务队列和最终结果。</w:t>
       </w:r>
     </w:p>
     <w:p>
@@ -1917,10 +1863,7 @@
         <w:t>现象：</w:t>
       </w:r>
       <w:r>
-        <w:rPr>
-          <w:b w:val="0"/>
-        </w:rPr>
-        <w:t>界面看起来正常，但播放器发送动作后机械臂没有响应，或者同一动作被重复触发。</w:t>
+        <w:t>界面看起来正常，但播放器发送动作后机械臂没有响应，或者同一动作被重复触发；在终端中可以看到同一阶段的输出出现两次。此时如果继续调节航点，会把进程冲突误认为姿态参数错误。</w:t>
       </w:r>
     </w:p>
     <w:p>
@@ -1931,10 +1874,7 @@
         <w:t>原因分析：</w:t>
       </w:r>
       <w:r>
-        <w:rPr>
-          <w:b w:val="0"/>
-        </w:rPr>
-        <w:t>我检查 world、controller 和播放器进程，发现旧 Gazebo master 与新实例同时存在。</w:t>
+        <w:t>我检查 world、controller 和播放器进程，发现旧 Gazebo master 与新实例同时存在，手动控制台也可能连接到旧的播放器。多个实例会同时监听控制主题，导致一套命令被重复消费或发往已经失效的控制器。</w:t>
       </w:r>
     </w:p>
     <w:p>
@@ -1945,10 +1885,7 @@
         <w:t>处理方法：</w:t>
       </w:r>
       <w:r>
-        <w:rPr>
-          <w:b w:val="0"/>
-        </w:rPr>
-        <w:t>结束旧进程，只保留一个世界；手动 GUI 已打开时直接连接播放器。</w:t>
+        <w:t>先结束旧的 gzserver、gzclient 和播放器进程，只保留一个世界实例，再按 start_contact_grasp.sh 的顺序启动 Gazebo、控制器和 manual_control_panel。自动模式只启动一个 sorting_gazebo.launch.py，并利用任务节点的检测签名去重和 plan_locked 标志，避免同一份计划被重新送入执行器。</w:t>
       </w:r>
     </w:p>
     <w:p>
@@ -1959,10 +1896,7 @@
         <w:t>验证结果：</w:t>
       </w:r>
       <w:r>
-        <w:rPr>
-          <w:b w:val="0"/>
-        </w:rPr>
-        <w:t>控制器只收到一套命令，单目标测试和整序列播放都按预期推进。</w:t>
+        <w:t>清理环境后，控制器只收到一套动作命令；单目标测试能够从 above、pick、lift 推进到 release，34 步完整序列也不再重复触发。验证时同时查看 GUI、sorting_task/execution_state 和 CSV 时间戳，确认问题来自重复实例而不是航点本身。</w:t>
       </w:r>
     </w:p>
     <w:p>
@@ -1981,10 +1915,7 @@
         <w:t>现象：</w:t>
       </w:r>
       <w:r>
-        <w:rPr>
-          <w:b w:val="0"/>
-        </w:rPr>
-        <w:t>任务节点启动后立即退出，终端提示日志调用参数不兼容。</w:t>
+        <w:t>任务节点启动后立即退出，终端提示日志调用参数不兼容，因而没有进入 detecting 或 plan_ready 状态。此时 Gazebo 画面仍然存在，但没有任务状态和对象级结果，后续抓取不能作为有效实验记录。</w:t>
       </w:r>
     </w:p>
     <w:p>
@@ -1995,10 +1926,7 @@
         <w:t>原因分析：</w:t>
       </w:r>
       <w:r>
-        <w:rPr>
-          <w:b w:val="0"/>
-        </w:rPr>
-        <w:t>我定位到 Humble Python logger 的调用方式与当前代码不一致，错误发生在真正进入任务状态机之前。</w:t>
+        <w:t>我把错误定位到 Humble Python logger 的调用方式：旧写法把额外参数交给日志函数处理，异常发生在真正进入任务状态机之前。通过查看节点退出位置和启动后的状态主题，确认这不是检测框或机械臂控制问题，而是节点初始化阶段的日志调用错误。</w:t>
       </w:r>
     </w:p>
     <w:p>
@@ -2009,10 +1937,7 @@
         <w:t>处理方法：</w:t>
       </w:r>
       <w:r>
-        <w:rPr>
-          <w:b w:val="0"/>
-        </w:rPr>
-        <w:t>改用兼容的 f-string 日志写法，重新构建并在干净终端中启动节点。</w:t>
+        <w:t>将相关日志改为兼容 Humble 的 f-string 写法，重新构建工作空间，并在干净终端中重新启动统一 Launch。启动后先检查 sorting_task/state、sorting_task/result 和 sorting_task/execution_state 是否存在，再运行单目标和完整序列，避免把未启动成功的进程直接纳入验收。</w:t>
       </w:r>
     </w:p>
     <w:p>
@@ -2023,10 +1948,7 @@
         <w:t>验证结果：</w:t>
       </w:r>
       <w:r>
-        <w:rPr>
-          <w:b w:val="0"/>
-        </w:rPr>
-        <w:t>节点保持运行并继续发布状态，抓取问题可以在稳定的启动环境中单独分析。</w:t>
+        <w:t>修复后节点保持运行并持续发布 detecting、plan_ready、执行阶段和 task_passed 状态，CSV 也能记录 plan、grasp_attached、release 和 task_result。这样抓取问题可以在稳定的启动环境中单独分析，日志错误不再掩盖任务本身的执行结果。</w:t>
       </w:r>
     </w:p>
     <w:tbl>

</xml_diff>

<commit_message>
report: correct personal scope and responsibilities
</commit_message>
<xml_diff>
--- a/report/experiment3_personal_report_yangmuqing.docx
+++ b/report/experiment3_personal_report_yangmuqing.docx
@@ -1110,28 +1110,7 @@
         <w:spacing w:line="276" w:lineRule="auto" w:after="100"/>
       </w:pPr>
       <w:r>
-        <w:rPr>
-          <w:rFonts w:ascii="Times New Roman" w:hAnsi="Times New Roman" w:eastAsia="Times New Roman"/>
-          <w:b w:val="0"/>
-          <w:color w:val="232323"/>
-          <w:sz w:val="20"/>
-        </w:rPr>
-        <w:t>采集并标注橡皮、锁、订书机三类自建数据集，组织训练集与验证集，并设计数据增强和针对性补拍方案。</w:t>
-      </w:r>
-    </w:p>
-    <w:p>
-      <w:pPr>
-        <w:pStyle w:val="ListBullet"/>
-        <w:spacing w:line="276" w:lineRule="auto" w:after="100"/>
-      </w:pPr>
-      <w:r>
-        <w:rPr>
-          <w:rFonts w:ascii="Times New Roman" w:hAnsi="Times New Roman" w:eastAsia="Times New Roman"/>
-          <w:b w:val="0"/>
-          <w:color w:val="232323"/>
-          <w:sz w:val="20"/>
-        </w:rPr>
-        <w:t>完成 YOLOv8n 模型训练、验证和外接摄像头实测，针对易混淆角度迭代样本与训练策略，为后续接入感知接口准备模型权重。</w:t>
+        <w:t>使用小组统一提供的检测结果，核对网格编号、类别和任务队列在执行节点中的传递，并将核对结果与动作日志对应。</w:t>
       </w:r>
     </w:p>
     <w:p>
@@ -4314,147 +4293,9 @@
     <w:p>
       <w:pPr>
         <w:pStyle w:val="Heading2"/>
-        <w:spacing w:line="276" w:lineRule="auto" w:after="100"/>
       </w:pPr>
       <w:r>
-        <w:rPr>
-          <w:rFonts w:ascii="Times New Roman" w:hAnsi="Times New Roman" w:eastAsia="Times New Roman"/>
-          <w:b/>
-          <w:color w:val="1F4E79"/>
-          <w:sz w:val="23"/>
-        </w:rPr>
-        <w:t>5.4 视觉检测模型训练与部署</w:t>
-      </w:r>
-    </w:p>
-    <w:p>
-      <w:pPr>
-        <w:spacing w:line="276" w:lineRule="auto" w:after="100"/>
-      </w:pPr>
-      <w:r>
-        <w:rPr>
-          <w:rFonts w:ascii="Times New Roman" w:hAnsi="Times New Roman" w:eastAsia="Times New Roman"/>
-          <w:b w:val="0"/>
-          <w:color w:val="232323"/>
-          <w:sz w:val="20"/>
-        </w:rPr>
-        <w:t>我负责分拣系统的三类目标检测模型，识别对象为橡皮、锁和订书机，模型输出类别、检测框和置信度。数据全部由小组自行拍摄，没有混入公开数据集图片；这样可以围绕实际外接摄像头的视角、光照和摆放方式持续补充样本，并把训练结果直接用于后续感知接口联调。</w:t>
-      </w:r>
-    </w:p>
-    <w:p>
-      <w:pPr>
-        <w:spacing w:line="276" w:lineRule="auto" w:after="100"/>
-      </w:pPr>
-      <w:r>
-        <w:rPr>
-          <w:rFonts w:ascii="Times New Roman" w:hAnsi="Times New Roman" w:eastAsia="Times New Roman"/>
-          <w:b w:val="0"/>
-          <w:color w:val="232323"/>
-          <w:sz w:val="20"/>
-        </w:rPr>
-        <w:t>数据集覆盖单物体、同框多物体、不同位置、朝向和光照条件。我使用 labelImg 逐张绘制边界框并填写类别，训练阶段采用马赛克拼接、色调扰动、随机缩放和随机擦除等增强；验证集从原始图片中独立划分，不做增强，用于观察模型在未改变样本上的实际水平。外接摄像头测试发现薄弱角度后，我继续补拍对应样本并重新训练。</w:t>
-      </w:r>
-    </w:p>
-    <w:p>
-      <w:pPr>
-        <w:spacing w:line="276" w:lineRule="auto" w:after="100"/>
-      </w:pPr>
-      <w:r>
-        <w:rPr>
-          <w:rFonts w:ascii="Times New Roman" w:hAnsi="Times New Roman" w:eastAsia="Times New Roman"/>
-          <w:b w:val="0"/>
-          <w:color w:val="232323"/>
-          <w:sz w:val="20"/>
-        </w:rPr>
-        <w:t>模型采用 YOLOv8n，输入分辨率 640，训练 60 轮，批大小 16，训练设备为 RTX 4070 Laptop GPU。模型约有 300 万参数，权重文件大小为 6.25 MB（约 6.3 MB）。根据训练记录，整体及橡皮、锁、订书机三个类别的 mAP50 和 mAP50-95 均为 0.995，精确率和召回率均达到 1.0；单张模型推理时间为 1.1 ms。下面的外接摄像头画面同时检出三类目标，置信度为 0.89–0.94，画面显示 31.2 FPS。31.2 FPS 是包含摄像头读取和画面显示的端到端帧率，与单张模型推理时间不是同一指标。</w:t>
-      </w:r>
-    </w:p>
-    <w:p>
-      <w:pPr>
-        <w:spacing w:line="276" w:lineRule="auto" w:after="100"/>
-      </w:pPr>
-      <w:r>
-        <w:rPr>
-          <w:rFonts w:ascii="Times New Roman" w:hAnsi="Times New Roman" w:eastAsia="Times New Roman"/>
-          <w:b w:val="0"/>
-          <w:color w:val="232323"/>
-          <w:sz w:val="20"/>
-        </w:rPr>
-        <w:t>模型迭代围绕四个实际问题展开。锁和订书机都是小型金属物体，早期存在类别混淆，我提高两类样本的训练比例，并补拍同框对比样本；订书机的个别角度与橡皮轮廓接近，我提高分类损失在训练中的作用，使模型不仅把框画准，也要把类别判对；新数据加入后早期样本特征被稀释，我提高早期样本的采样权重重新训练；验证集分数较好但实拍仍有差异时，我以外接摄像头结果为准定位薄弱场景，再进行针对性补拍。整体 mAP50-95 从优化前的 0.938 提升到最终版的 0.995。</w:t>
-      </w:r>
-    </w:p>
-    <w:p>
-      <w:pPr>
-        <w:spacing w:line="276" w:lineRule="auto" w:after="100"/>
-        <w:jc w:val="center"/>
-      </w:pPr>
-      <w:r>
-        <w:rPr>
-          <w:rFonts w:ascii="Times New Roman" w:hAnsi="Times New Roman" w:eastAsia="Times New Roman"/>
-          <w:b w:val="0"/>
-          <w:color w:val="232323"/>
-          <w:sz w:val="20"/>
-        </w:rPr>
-        <w:drawing>
-          <wp:inline xmlns:a="http://schemas.openxmlformats.org/drawingml/2006/main" xmlns:pic="http://schemas.openxmlformats.org/drawingml/2006/picture">
-            <wp:extent cx="5257800" cy="3541083"/>
-            <wp:docPr id="13" name="Picture 13"/>
-            <wp:cNvGraphicFramePr>
-              <a:graphicFrameLocks noChangeAspect="1"/>
-            </wp:cNvGraphicFramePr>
-            <a:graphic>
-              <a:graphicData uri="http://schemas.openxmlformats.org/drawingml/2006/picture">
-                <pic:pic>
-                  <pic:nvPicPr>
-                    <pic:cNvPr id="0" name="b028d3f11213205b74b2a37d8148411b.jpg"/>
-                    <pic:cNvPicPr/>
-                  </pic:nvPicPr>
-                  <pic:blipFill>
-                    <a:blip r:embed="rId22"/>
-                    <a:stretch>
-                      <a:fillRect/>
-                    </a:stretch>
-                  </pic:blipFill>
-                  <pic:spPr>
-                    <a:xfrm>
-                      <a:off x="0" y="0"/>
-                      <a:ext cx="5257800" cy="3541083"/>
-                    </a:xfrm>
-                    <a:prstGeom prst="rect"/>
-                  </pic:spPr>
-                </pic:pic>
-              </a:graphicData>
-            </a:graphic>
-          </wp:inline>
-        </w:drawing>
-      </w:r>
-    </w:p>
-    <w:p>
-      <w:pPr>
-        <w:pStyle w:val="CaptionCustom"/>
-        <w:jc w:val="center"/>
-      </w:pPr>
-      <w:r>
-        <w:rPr>
-          <w:rFonts w:ascii="Times New Roman" w:hAnsi="Times New Roman" w:eastAsia="Times New Roman"/>
-          <w:b w:val="0"/>
-          <w:color w:val="5A5A5A"/>
-          <w:sz w:val="18"/>
-        </w:rPr>
-        <w:t>图 11  外接摄像头同时识别橡皮、锁和订书机的实测画面</w:t>
-      </w:r>
-    </w:p>
-    <w:p>
-      <w:pPr>
-        <w:pStyle w:val="Heading2"/>
-      </w:pPr>
-      <w:r>
-        <w:rPr>
-          <w:rFonts w:ascii="Times New Roman" w:hAnsi="Times New Roman" w:eastAsia="Times New Roman"/>
-          <w:b/>
-          <w:color w:val="1F4E79"/>
-          <w:sz w:val="23"/>
-        </w:rPr>
-        <w:t>5.5 个人总结</w:t>
+        <w:t>5.4 个人总结</w:t>
       </w:r>
     </w:p>
     <w:p>
@@ -4612,13 +4453,7 @@
         <w:spacing w:line="276" w:lineRule="auto" w:after="100"/>
       </w:pPr>
       <w:r>
-        <w:rPr>
-          <w:rFonts w:ascii="Times New Roman" w:hAnsi="Times New Roman" w:eastAsia="Times New Roman"/>
-          <w:b w:val="0"/>
-          <w:color w:val="232323"/>
-          <w:sz w:val="20"/>
-        </w:rPr>
-        <w:t>我完成了实验三仿真执行侧的主要个人工作，并把个人贡献落实到场景、航点、状态和证据四个层面。通过场景调整、手动示教、动作修复、自动播放和对象级复核，我参与建立了从任务规划结果到机械臂动作，再到实验结论的完整链路。红蓝两类六个目标的对象级结果达到 6/6，三分类扩展完成了场景、分类垫和自动序列的集成。 同时，我完成了橡皮、锁和订书机三类 YOLOv8n 检测模型的训练、评估和外接摄像头验证，为后续真机感知接入提供了实际权重和检测结果。</w:t>
+        <w:t>我完成了实验三仿真执行侧的主要个人工作，并把个人贡献落实到场景、航点、状态和证据四个层面。通过场景调整、手动示教、动作修复、自动播放和对象级复核，我参与建立了从任务规划结果到机械臂动作、再到实验结论的完整链路。红蓝六个目标的对象级结果达到 6/6，三分类扩展完成了场景、分类垫和自动序列的联调。在执行侧，我使用小组提供的检测结果检查后续网格映射、抓取和释放流程。</w:t>
       </w:r>
     </w:p>
     <w:p>
@@ -5386,13 +5221,7 @@
         <w:spacing w:after="100" w:line="276" w:lineRule="auto"/>
       </w:pPr>
       <w:r>
-        <w:rPr>
-          <w:rFonts w:ascii="Times New Roman" w:hAnsi="Times New Roman" w:eastAsia="Times New Roman"/>
-          <w:b w:val="0"/>
-          <w:color w:val="232323"/>
-          <w:sz w:val="20"/>
-        </w:rPr>
-        <w:t>仓库中保留 ROS 2 工程、models 目录中的三类 YOLOv8n 权重、Gazebo 场景、manual_animation.json、对象级执行记录、过程截图以及小组和个人报告；两段 Gazebo 仿真演示视频也已放入 videos/ 目录。提交历史截图用于说明材料已经同步到公开仓库；本报告中的问题、调整和验证证据均能在报告、截图、日志和仓库目录之间对应起来。</w:t>
+        <w:t>仓库中保留 ROS 2 工程、Gazebo 场景、manual_animation.json、对象级执行记录、过程截图以及小组和个人报告；两段 Gazebo 仿真演示视频也已放入 videos/ 目录。提交历史截图和说明用于证明材料已经同步到公共仓库，个人报告中的问题、调整和验证记录均可在报告、截图、日志及仓库目录之间对应。</w:t>
       </w:r>
     </w:p>
     <w:p>
@@ -5448,13 +5277,7 @@
         <w:jc w:val="center"/>
       </w:pPr>
       <w:r>
-        <w:rPr>
-          <w:rFonts w:ascii="Times New Roman" w:hAnsi="Times New Roman" w:eastAsia="Times New Roman"/>
-          <w:b w:val="0"/>
-          <w:color w:val="232323"/>
-          <w:sz w:val="20"/>
-        </w:rPr>
-        <w:t>图 12  个人实验报告对应的 GitHub 实验三仓库提交历史</w:t>
+        <w:t>图 11  个人实验报告对应的 GitHub 实验三仓库提交历史</w:t>
       </w:r>
     </w:p>
     <w:sectPr>

</xml_diff>

<commit_message>
report: sync final Chinese personal report
</commit_message>
<xml_diff>
--- a/report/experiment3_personal_report_yangmuqing.docx
+++ b/report/experiment3_personal_report_yangmuqing.docx
@@ -4295,7 +4295,7 @@
           <w:color w:val="232323"/>
           <w:sz w:val="20"/>
         </w:rPr>
-        <w:t>这次实验让我认识到，机械臂仿真要求同时保证关节运动、场景模型、控制接口、任务逻辑和验收证据的一致性。一个动作只有在“目标被正确选中、夹爪与目标相对位置满足条件、目标高度发生变化、事件顺序完整、最终位姿落在分类区域”时，才具备可复查的成功依据。这个认识改变了我对仿真结果的判断方式：我开始把画面、状态和数据看成同一件事的不同观测，而不是只看机械臂是否完成了一段轨迹。</w:t>
+        <w:t>这次实验使我建立了更完整的动作验收观念。机械臂完成一段轨迹，并不等同于物体分拣成功；我需要同时检查目标是否选对、末端是否对准、夹爪是否形成有效夹持、物体是否真正离桌、释放事件是否按顺序发生，以及最终位姿是否进入对应分类区。将画面、状态主题、事件日志和对象级记录放在一起核对后，我能够把一次看似连续的动作拆成若干可以独立判断的环节。</w:t>
       </w:r>
     </w:p>
     <w:p>
@@ -4309,7 +4309,7 @@
           <w:color w:val="232323"/>
           <w:sz w:val="20"/>
         </w:rPr>
-        <w:t>在调试过程中，我逐渐形成了固定的排查顺序。第一步是把问题缩小到扫描、网格定位、接近、抓取、搬运、释放或验收中的一个阶段；第二步是用单目标和手动面板复现现象，记录末端位置、目标位置、夹爪状态和当前航点；第三步是一次只修改一个变量，例如像素网格、抓取高度、夹爪开度、释放高度或动作时间；第四步是用事件日志、最终坐标和完整序列复核修改结果。网格错位、释放跳变、目标未附着和重复启动等问题，都按照这套顺序得到定位。</w:t>
+        <w:t>夹爪闭合但圆柱没有离桌的问题最能体现这种变化。最初只看播放画面时，夹爪动作正常，很容易把问题归因于 Gazebo 接触不稳定；我将序列暂停在 above、pick 和 lift 三个阶段，比较末端与圆柱中心的相对位置、目标高度及 attached 事件，才发现播放器只发送了夹爪命令，没有在搬运阶段维持目标与末端的相对位姿。加入距离检查、附着条件和持续跟随后，再用单目标子序列复跑，画面中圆柱离开桌面，CSV 也依次出现 grasp_attached、lift、release 和 object_complete。这个过程让我认识到，原因判断必须建立在阶段化证据上。</w:t>
       </w:r>
     </w:p>
     <w:p>
@@ -4403,7 +4403,7 @@
           <w:color w:val="232323"/>
           <w:sz w:val="20"/>
         </w:rPr>
-        <w:t>这次实验还让我熟悉了模块之间的接口责任。任务节点负责生成对象顺序和分类目标，执行节点负责完成动作与反馈，场景和日志负责提供复核依据。我的工作位于任务规划结果与仿真验收之间，需要把抽象的任务项落实成可执行的姿态、航点和状态检查。这使我更加重视命名、参数记录、日志字段和图片说明的完整性，因为它们直接影响小组成员之间的协作和后续复现。</w:t>
+        <w:t>协作过程中，我进一步理解了接口一致性对集成实验的影响。任务节点输出的 object_id、grid_id 和 target_bin，必须能够在航点名称、执行状态、日志字段和报告图表中找到对应关系；否则，即使单个节点能够运行，也难以判断整条链路是否处理了同一个目标。我在整理航点与证据时统一了命名和核对顺序，使场景调整、动作调试和最终验收可以围绕同一对象展开。</w:t>
       </w:r>
     </w:p>
     <w:p>
@@ -4417,7 +4417,7 @@
           <w:color w:val="232323"/>
           <w:sz w:val="20"/>
         </w:rPr>
-        <w:t>仿真中的逻辑附着提升了动作重复性，也让我看清了仿真与真机之间的差异。真实系统还需要重新标定相机映射、夹爪摩擦、接近高度、闭合速度、释放等待和急停距离。后续迁移到真机时，我会沿用“低速单目标—检查识别—检查抓取—检查释放—加入第二类—扩展到六目标”的顺序，每一步保存对象级记录，再决定是否进入下一阶段。</w:t>
+        <w:t>仿真中的逻辑附着提高了动作重复性，也让我更清楚地认识到真机迁移需要重新验证的参数。夹爪摩擦、目标表面形状、相机映射误差、接近高度和释放等待都会改变真实抓取结果。因此，后续真机调试应从低速单目标开始，分别检查识别、接近、夹持、抬升和释放，再加入第二类物体并扩展到六目标；每一步保存画面、状态和对象级记录，形成与仿真阶段一致的复核方法。</w:t>
       </w:r>
     </w:p>
     <w:p>
@@ -4439,7 +4439,7 @@
         <w:spacing w:line="276" w:lineRule="auto" w:after="100"/>
       </w:pPr>
       <w:r>
-        <w:t>我完成了实验三仿真执行侧的主要个人工作，并把个人贡献落实到场景、航点、状态和证据四个层面。通过场景调整、手动示教、动作修复、自动播放和对象级复核，我参与建立了从任务规划结果到机械臂动作、再到实验结论的完整链路。红蓝六个目标的对象级结果达到 6/6，三分类扩展完成了场景、分类垫和自动序列的联调。在执行侧，我使用小组提供的检测结果检查后续网格映射、抓取和释放流程。</w:t>
+        <w:t>本次实验中，我完成了六格桌面与分类垫调整、机械臂航点示教、自动播放组织、抓取附着与释放动作修正，以及运行结果复核。相关工作把任务节点给出的网格和分类目标转化为可执行的 above、pick、lift、release 与回撤动作，并通过状态、事件、最终位姿和对象级 CSV 检查每个目标的完成情况。红蓝六目标仿真基线达到 6/6，三分类扩展完成场景、绿色目标航点和 34 步播放序列的联调。</w:t>
       </w:r>
     </w:p>
     <w:p>
@@ -5100,7 +5100,7 @@
           <w:color w:val="232323"/>
           <w:sz w:val="20"/>
         </w:rPr>
-        <w:t>我掌握了 Gazebo 场景参数与 ROS 2 控制器之间的联调方法，能够从世界坐标、像素网格、末端姿态和对象状态四个角度检查同一动作。通过手动控制台和 JSON 航点文件，我熟悉了从单点测试到完整序列的动作组织方式；通过状态主题、事件日志和对象级 CSV，我能够把一次运行拆分为可定位、可比较的阶段。</w:t>
+        <w:t>通过本次实验，我能够从世界坐标、像素网格、末端姿态和对象状态四个层面分析同一动作，并使用手动控制台、JSON 航点、状态主题和 CSV 记录定位问题。相比只观察最终画面，我现在更关注动作进入了哪个阶段、该阶段接收了什么输入、产生了什么事件，以及退出条件是否真正满足。这种方法使姿态偏差、未附着、释放跳变和重复启动等问题都能被缩小到具体环节。</w:t>
       </w:r>
     </w:p>
     <w:p>
@@ -5114,7 +5114,7 @@
           <w:color w:val="232323"/>
           <w:sz w:val="20"/>
         </w:rPr>
-        <w:t>在协作方面，我进一步理解了统一接口和统一命名的重要性。任务节点输出的 object_id、grid_id 和 target_bin，必须与执行节点的航点、日志和最终位姿相互对应，报告中的图片和表格也要能够回到具体对象。这样的记录方式提高了问题定位效率，也使个人调试结果能够直接支持小组验收。</w:t>
+        <w:t>在小组协作方面，我学会了用统一字段连接不同成员的工作：检测和任务规划提供 object_id、grid_id、类别与目标分类区，执行侧用同一组字段选择航点并记录结果，报告中的图片和表格再回到具体对象进行说明。这样既减少了口头描述中的歧义，也使我的动作调试结果能够直接进入小组的验收材料。</w:t>
       </w:r>
     </w:p>
     <w:p>
@@ -5604,6 +5604,20 @@
         </w:tc>
       </w:tr>
     </w:tbl>
+    <w:p>
+      <w:pPr>
+        <w:pStyle w:val="Heading2"/>
+      </w:pPr>
+      <w:r>
+        <w:t>6.5 仓库材料复核顺序</w:t>
+      </w:r>
+    </w:p>
+    <w:p>
+      <w:pPr/>
+      <w:r>
+        <w:t>复核个人工作时，可先查看 code/src/mecharm_fixed_pick_sim/worlds/sorting_desktop.world 确认六格桌面和分类垫，再在 code/manual_animation.json 中检查 above、pick、lift、release 航点及六目标播放顺序；随后结合 evidence/ERROR_LOG.md、执行 CSV 和 Gazebo 视频核对问题现象、修改内容与最终结果。该顺序与本报告的“场景—动作—问题—结果”结构一致。</w:t>
+      </w:r>
+    </w:p>
     <w:sectPr>
       <w:headerReference w:type="default" r:id="rId9"/>
       <w:footerReference w:type="default" r:id="rId10"/>

</xml_diff>